<commit_message>
Canon municipal 2007–2024 desde el MEF (Consulta Amigable de Ingresos): notebook con Playwright, mapa con fuente por periodo y diccionarios
Co-Authored-By: Claude Opus 5.5 <noreply@anthropic.com>
Claude-Session: https://claude.ai/code/session_01DrqJkouEJ5iuRzFV6cVyPN
</commit_message>
<xml_diff>
--- a/HIDROCARBUROS/docs/diccionarios/00_Diccionario_general_DATA.docx
+++ b/HIDROCARBUROS/docs/diccionarios/00_Diccionario_general_DATA.docx
@@ -1580,6 +1580,107 @@
                 <w:sz w:val="24"/>
                 <w:szCs w:val="24"/>
               </w:rPr>
+              <w:t xml:space="preserve">PP_canon_municipal_mef_anio.csv</w:t>
+            </w:r>
+          </w:p>
+        </w:tc>
+        <w:tc>
+          <w:tcPr>
+            <w:tcW w:type="dxa" w:w="1700"/>
+            <w:tcBorders>
+              <w:top w:val="none" w:color="FFFFFF" w:sz="0"/>
+              <w:left w:val="none" w:color="FFFFFF" w:sz="0"/>
+              <w:bottom w:val="none" w:color="FFFFFF" w:sz="0"/>
+              <w:right w:val="none" w:color="FFFFFF" w:sz="0"/>
+            </w:tcBorders>
+            <w:tcMar>
+              <w:top w:type="dxa" w:w="60"/>
+              <w:left w:type="dxa" w:w="100"/>
+              <w:bottom w:type="dxa" w:w="60"/>
+              <w:right w:type="dxa" w:w="100"/>
+            </w:tcMar>
+          </w:tcPr>
+          <w:p>
+            <w:pPr>
+              <w:spacing w:line="240"/>
+              <w:jc w:val="left"/>
+            </w:pPr>
+            <w:r>
+              <w:rPr>
+                <w:rFonts w:ascii="Arial" w:cs="Arial" w:eastAsia="Arial" w:hAnsi="Arial"/>
+                <w:color w:val="000000"/>
+                <w:sz w:val="24"/>
+                <w:szCs w:val="24"/>
+              </w:rPr>
+              <w:t xml:space="preserve">Útil</w:t>
+            </w:r>
+          </w:p>
+        </w:tc>
+        <w:tc>
+          <w:tcPr>
+            <w:tcW w:type="dxa" w:w="3626"/>
+            <w:tcBorders>
+              <w:top w:val="none" w:color="FFFFFF" w:sz="0"/>
+              <w:left w:val="none" w:color="FFFFFF" w:sz="0"/>
+              <w:bottom w:val="none" w:color="FFFFFF" w:sz="0"/>
+              <w:right w:val="none" w:color="FFFFFF" w:sz="0"/>
+            </w:tcBorders>
+            <w:tcMar>
+              <w:top w:type="dxa" w:w="60"/>
+              <w:left w:type="dxa" w:w="100"/>
+              <w:bottom w:type="dxa" w:w="60"/>
+              <w:right w:type="dxa" w:w="100"/>
+            </w:tcMar>
+          </w:tcPr>
+          <w:p>
+            <w:pPr>
+              <w:spacing w:line="240"/>
+              <w:jc w:val="both"/>
+            </w:pPr>
+            <w:r>
+              <w:rPr>
+                <w:rFonts w:ascii="Arial" w:cs="Arial" w:eastAsia="Arial" w:hAnsi="Arial"/>
+                <w:color w:val="000000"/>
+                <w:sz w:val="24"/>
+                <w:szCs w:val="24"/>
+              </w:rPr>
+              <w:t xml:space="preserve">Canon y sobrecanon petrolero recaudado por cada municipalidad y año según el MEF (2007–hoy); completa los años sin detalle de PERUPETRO.</w:t>
+            </w:r>
+          </w:p>
+        </w:tc>
+      </w:tr>
+      <w:tr>
+        <w:trPr>
+          <w:cantSplit/>
+        </w:trPr>
+        <w:tc>
+          <w:tcPr>
+            <w:tcW w:type="dxa" w:w="3700"/>
+            <w:tcBorders>
+              <w:top w:val="none" w:color="FFFFFF" w:sz="0"/>
+              <w:left w:val="none" w:color="FFFFFF" w:sz="0"/>
+              <w:bottom w:val="none" w:color="FFFFFF" w:sz="0"/>
+              <w:right w:val="none" w:color="FFFFFF" w:sz="0"/>
+            </w:tcBorders>
+            <w:tcMar>
+              <w:top w:type="dxa" w:w="60"/>
+              <w:left w:type="dxa" w:w="100"/>
+              <w:bottom w:type="dxa" w:w="60"/>
+              <w:right w:type="dxa" w:w="100"/>
+            </w:tcMar>
+          </w:tcPr>
+          <w:p>
+            <w:pPr>
+              <w:spacing w:line="240"/>
+              <w:jc w:val="left"/>
+            </w:pPr>
+            <w:r>
+              <w:rPr>
+                <w:rFonts w:ascii="Arial" w:cs="Arial" w:eastAsia="Arial" w:hAnsi="Arial"/>
+                <w:color w:val="000000"/>
+                <w:sz w:val="24"/>
+                <w:szCs w:val="24"/>
+              </w:rPr>
               <w:t xml:space="preserve">PP_canon_departamento_mes.csv</w:t>
             </w:r>
           </w:p>
@@ -3728,6 +3829,42 @@
           <w:szCs w:val="24"/>
         </w:rPr>
         <w:t xml:space="preserve">(15), 2171–2186. https://doi.org/10.1002/hyp.9740</w:t>
+      </w:r>
+    </w:p>
+    <w:p>
+      <w:pPr>
+        <w:spacing w:line="480"/>
+        <w:ind w:left="720" w:hanging="720"/>
+        <w:jc w:val="both"/>
+      </w:pPr>
+      <w:r>
+        <w:rPr>
+          <w:rFonts w:ascii="Arial" w:cs="Arial" w:eastAsia="Arial" w:hAnsi="Arial"/>
+          <w:color w:val="000000"/>
+          <w:sz w:val="24"/>
+          <w:szCs w:val="24"/>
+        </w:rPr>
+        <w:t xml:space="preserve">Ministerio de Economía y Finanzas. (s. f.). </w:t>
+      </w:r>
+      <w:r>
+        <w:rPr>
+          <w:rFonts w:ascii="Arial" w:cs="Arial" w:eastAsia="Arial" w:hAnsi="Arial"/>
+          <w:i/>
+          <w:iCs/>
+          <w:color w:val="000000"/>
+          <w:sz w:val="24"/>
+          <w:szCs w:val="24"/>
+        </w:rPr>
+        <w:t xml:space="preserve">Consulta Amigable de Ingresos (mensual)</w:t>
+      </w:r>
+      <w:r>
+        <w:rPr>
+          <w:rFonts w:ascii="Arial" w:cs="Arial" w:eastAsia="Arial" w:hAnsi="Arial"/>
+          <w:color w:val="000000"/>
+          <w:sz w:val="24"/>
+          <w:szCs w:val="24"/>
+        </w:rPr>
+        <w:t xml:space="preserve"> [Base de datos]. Recuperado el 20 de octubre de 2026, de https://apps5.mineco.gob.pe/transparenciaingresos/mensual/</w:t>
       </w:r>
     </w:p>
     <w:p>

</xml_diff>

<commit_message>
MEF canon: distribución por nivel de gobierno (E, M, R; total país y por departamento) antes del detalle municipal, con control y diccionario
Co-Authored-By: Claude Opus 5.5 <noreply@anthropic.com>
Claude-Session: https://claude.ai/code/session_01DrqJkouEJ5iuRzFV6cVyPN
</commit_message>
<xml_diff>
--- a/HIDROCARBUROS/docs/diccionarios/00_Diccionario_general_DATA.docx
+++ b/HIDROCARBUROS/docs/diccionarios/00_Diccionario_general_DATA.docx
@@ -1544,6 +1544,107 @@
                 <w:szCs w:val="24"/>
               </w:rPr>
               <w:t xml:space="preserve">Canon por municipalidad provincial y distrital y mes (S/): año en curso y 1993–2002.</w:t>
+            </w:r>
+          </w:p>
+        </w:tc>
+      </w:tr>
+      <w:tr>
+        <w:trPr>
+          <w:cantSplit/>
+        </w:trPr>
+        <w:tc>
+          <w:tcPr>
+            <w:tcW w:type="dxa" w:w="3700"/>
+            <w:tcBorders>
+              <w:top w:val="none" w:color="FFFFFF" w:sz="0"/>
+              <w:left w:val="none" w:color="FFFFFF" w:sz="0"/>
+              <w:bottom w:val="none" w:color="FFFFFF" w:sz="0"/>
+              <w:right w:val="none" w:color="FFFFFF" w:sz="0"/>
+            </w:tcBorders>
+            <w:tcMar>
+              <w:top w:type="dxa" w:w="60"/>
+              <w:left w:type="dxa" w:w="100"/>
+              <w:bottom w:type="dxa" w:w="60"/>
+              <w:right w:type="dxa" w:w="100"/>
+            </w:tcMar>
+          </w:tcPr>
+          <w:p>
+            <w:pPr>
+              <w:spacing w:line="240"/>
+              <w:jc w:val="left"/>
+            </w:pPr>
+            <w:r>
+              <w:rPr>
+                <w:rFonts w:ascii="Arial" w:cs="Arial" w:eastAsia="Arial" w:hAnsi="Arial"/>
+                <w:color w:val="000000"/>
+                <w:sz w:val="24"/>
+                <w:szCs w:val="24"/>
+              </w:rPr>
+              <w:t xml:space="preserve">PP_canon_nivel_gobierno_mef_anio.csv</w:t>
+            </w:r>
+          </w:p>
+        </w:tc>
+        <w:tc>
+          <w:tcPr>
+            <w:tcW w:type="dxa" w:w="1700"/>
+            <w:tcBorders>
+              <w:top w:val="none" w:color="FFFFFF" w:sz="0"/>
+              <w:left w:val="none" w:color="FFFFFF" w:sz="0"/>
+              <w:bottom w:val="none" w:color="FFFFFF" w:sz="0"/>
+              <w:right w:val="none" w:color="FFFFFF" w:sz="0"/>
+            </w:tcBorders>
+            <w:tcMar>
+              <w:top w:type="dxa" w:w="60"/>
+              <w:left w:type="dxa" w:w="100"/>
+              <w:bottom w:type="dxa" w:w="60"/>
+              <w:right w:type="dxa" w:w="100"/>
+            </w:tcMar>
+          </w:tcPr>
+          <w:p>
+            <w:pPr>
+              <w:spacing w:line="240"/>
+              <w:jc w:val="left"/>
+            </w:pPr>
+            <w:r>
+              <w:rPr>
+                <w:rFonts w:ascii="Arial" w:cs="Arial" w:eastAsia="Arial" w:hAnsi="Arial"/>
+                <w:color w:val="000000"/>
+                <w:sz w:val="24"/>
+                <w:szCs w:val="24"/>
+              </w:rPr>
+              <w:t xml:space="preserve">Útil</w:t>
+            </w:r>
+          </w:p>
+        </w:tc>
+        <w:tc>
+          <w:tcPr>
+            <w:tcW w:type="dxa" w:w="3626"/>
+            <w:tcBorders>
+              <w:top w:val="none" w:color="FFFFFF" w:sz="0"/>
+              <w:left w:val="none" w:color="FFFFFF" w:sz="0"/>
+              <w:bottom w:val="none" w:color="FFFFFF" w:sz="0"/>
+              <w:right w:val="none" w:color="FFFFFF" w:sz="0"/>
+            </w:tcBorders>
+            <w:tcMar>
+              <w:top w:type="dxa" w:w="60"/>
+              <w:left w:type="dxa" w:w="100"/>
+              <w:bottom w:type="dxa" w:w="60"/>
+              <w:right w:type="dxa" w:w="100"/>
+            </w:tcMar>
+          </w:tcPr>
+          <w:p>
+            <w:pPr>
+              <w:spacing w:line="240"/>
+              <w:jc w:val="both"/>
+            </w:pPr>
+            <w:r>
+              <w:rPr>
+                <w:rFonts w:ascii="Arial" w:cs="Arial" w:eastAsia="Arial" w:hAnsi="Arial"/>
+                <w:color w:val="000000"/>
+                <w:sz w:val="24"/>
+                <w:szCs w:val="24"/>
+              </w:rPr>
+              <w:t xml:space="preserve">Canon y sobrecanon petrolero recaudado por nivel de gobierno (nacional, locales, regionales), total país y por departamento, según el MEF (2003–hoy).</w:t>
             </w:r>
           </w:p>
         </w:tc>

</xml_diff>

<commit_message>
MEF canon: versión mensual (municipalidades y niveles de gobierno por mes, control suma de meses = año); diccionarios PDF y Word; resumen de la serie anual
Co-Authored-By: Claude Opus 5.5 <noreply@anthropic.com>
Claude-Session: https://claude.ai/code/session_01DrqJkouEJ5iuRzFV6cVyPN
</commit_message>
<xml_diff>
--- a/HIDROCARBUROS/docs/diccionarios/00_Diccionario_general_DATA.docx
+++ b/HIDROCARBUROS/docs/diccionarios/00_Diccionario_general_DATA.docx
@@ -1745,7 +1745,209 @@
                 <w:sz w:val="24"/>
                 <w:szCs w:val="24"/>
               </w:rPr>
-              <w:t xml:space="preserve">Canon y sobrecanon petrolero recaudado por cada municipalidad y año según el MEF (2007–hoy); completa los años sin detalle de PERUPETRO.</w:t>
+              <w:t xml:space="preserve">Canon y sobrecanon petrolero recaudado por cada municipalidad y año según el MEF (2005–hoy); completa los años sin detalle de PERUPETRO.</w:t>
+            </w:r>
+          </w:p>
+        </w:tc>
+      </w:tr>
+      <w:tr>
+        <w:trPr>
+          <w:cantSplit/>
+        </w:trPr>
+        <w:tc>
+          <w:tcPr>
+            <w:tcW w:type="dxa" w:w="3700"/>
+            <w:tcBorders>
+              <w:top w:val="none" w:color="FFFFFF" w:sz="0"/>
+              <w:left w:val="none" w:color="FFFFFF" w:sz="0"/>
+              <w:bottom w:val="none" w:color="FFFFFF" w:sz="0"/>
+              <w:right w:val="none" w:color="FFFFFF" w:sz="0"/>
+            </w:tcBorders>
+            <w:tcMar>
+              <w:top w:type="dxa" w:w="60"/>
+              <w:left w:type="dxa" w:w="100"/>
+              <w:bottom w:type="dxa" w:w="60"/>
+              <w:right w:type="dxa" w:w="100"/>
+            </w:tcMar>
+          </w:tcPr>
+          <w:p>
+            <w:pPr>
+              <w:spacing w:line="240"/>
+              <w:jc w:val="left"/>
+            </w:pPr>
+            <w:r>
+              <w:rPr>
+                <w:rFonts w:ascii="Arial" w:cs="Arial" w:eastAsia="Arial" w:hAnsi="Arial"/>
+                <w:color w:val="000000"/>
+                <w:sz w:val="24"/>
+                <w:szCs w:val="24"/>
+              </w:rPr>
+              <w:t xml:space="preserve">PP_canon_municipal_mef_mes.csv</w:t>
+            </w:r>
+          </w:p>
+        </w:tc>
+        <w:tc>
+          <w:tcPr>
+            <w:tcW w:type="dxa" w:w="1700"/>
+            <w:tcBorders>
+              <w:top w:val="none" w:color="FFFFFF" w:sz="0"/>
+              <w:left w:val="none" w:color="FFFFFF" w:sz="0"/>
+              <w:bottom w:val="none" w:color="FFFFFF" w:sz="0"/>
+              <w:right w:val="none" w:color="FFFFFF" w:sz="0"/>
+            </w:tcBorders>
+            <w:tcMar>
+              <w:top w:type="dxa" w:w="60"/>
+              <w:left w:type="dxa" w:w="100"/>
+              <w:bottom w:type="dxa" w:w="60"/>
+              <w:right w:type="dxa" w:w="100"/>
+            </w:tcMar>
+          </w:tcPr>
+          <w:p>
+            <w:pPr>
+              <w:spacing w:line="240"/>
+              <w:jc w:val="left"/>
+            </w:pPr>
+            <w:r>
+              <w:rPr>
+                <w:rFonts w:ascii="Arial" w:cs="Arial" w:eastAsia="Arial" w:hAnsi="Arial"/>
+                <w:color w:val="000000"/>
+                <w:sz w:val="24"/>
+                <w:szCs w:val="24"/>
+              </w:rPr>
+              <w:t xml:space="preserve">Útil</w:t>
+            </w:r>
+          </w:p>
+        </w:tc>
+        <w:tc>
+          <w:tcPr>
+            <w:tcW w:type="dxa" w:w="3626"/>
+            <w:tcBorders>
+              <w:top w:val="none" w:color="FFFFFF" w:sz="0"/>
+              <w:left w:val="none" w:color="FFFFFF" w:sz="0"/>
+              <w:bottom w:val="none" w:color="FFFFFF" w:sz="0"/>
+              <w:right w:val="none" w:color="FFFFFF" w:sz="0"/>
+            </w:tcBorders>
+            <w:tcMar>
+              <w:top w:type="dxa" w:w="60"/>
+              <w:left w:type="dxa" w:w="100"/>
+              <w:bottom w:type="dxa" w:w="60"/>
+              <w:right w:type="dxa" w:w="100"/>
+            </w:tcMar>
+          </w:tcPr>
+          <w:p>
+            <w:pPr>
+              <w:spacing w:line="240"/>
+              <w:jc w:val="both"/>
+            </w:pPr>
+            <w:r>
+              <w:rPr>
+                <w:rFonts w:ascii="Arial" w:cs="Arial" w:eastAsia="Arial" w:hAnsi="Arial"/>
+                <w:color w:val="000000"/>
+                <w:sz w:val="24"/>
+                <w:szCs w:val="24"/>
+              </w:rPr>
+              <w:t xml:space="preserve">Canon y sobrecanon petrolero recaudado por cada municipalidad y mes según el MEF (2005–hoy).</w:t>
+            </w:r>
+          </w:p>
+        </w:tc>
+      </w:tr>
+      <w:tr>
+        <w:trPr>
+          <w:cantSplit/>
+        </w:trPr>
+        <w:tc>
+          <w:tcPr>
+            <w:tcW w:type="dxa" w:w="3700"/>
+            <w:tcBorders>
+              <w:top w:val="none" w:color="FFFFFF" w:sz="0"/>
+              <w:left w:val="none" w:color="FFFFFF" w:sz="0"/>
+              <w:bottom w:val="none" w:color="FFFFFF" w:sz="0"/>
+              <w:right w:val="none" w:color="FFFFFF" w:sz="0"/>
+            </w:tcBorders>
+            <w:tcMar>
+              <w:top w:type="dxa" w:w="60"/>
+              <w:left w:type="dxa" w:w="100"/>
+              <w:bottom w:type="dxa" w:w="60"/>
+              <w:right w:type="dxa" w:w="100"/>
+            </w:tcMar>
+          </w:tcPr>
+          <w:p>
+            <w:pPr>
+              <w:spacing w:line="240"/>
+              <w:jc w:val="left"/>
+            </w:pPr>
+            <w:r>
+              <w:rPr>
+                <w:rFonts w:ascii="Arial" w:cs="Arial" w:eastAsia="Arial" w:hAnsi="Arial"/>
+                <w:color w:val="000000"/>
+                <w:sz w:val="24"/>
+                <w:szCs w:val="24"/>
+              </w:rPr>
+              <w:t xml:space="preserve">PP_canon_nivel_gobierno_mef_mes.csv</w:t>
+            </w:r>
+          </w:p>
+        </w:tc>
+        <w:tc>
+          <w:tcPr>
+            <w:tcW w:type="dxa" w:w="1700"/>
+            <w:tcBorders>
+              <w:top w:val="none" w:color="FFFFFF" w:sz="0"/>
+              <w:left w:val="none" w:color="FFFFFF" w:sz="0"/>
+              <w:bottom w:val="none" w:color="FFFFFF" w:sz="0"/>
+              <w:right w:val="none" w:color="FFFFFF" w:sz="0"/>
+            </w:tcBorders>
+            <w:tcMar>
+              <w:top w:type="dxa" w:w="60"/>
+              <w:left w:type="dxa" w:w="100"/>
+              <w:bottom w:type="dxa" w:w="60"/>
+              <w:right w:type="dxa" w:w="100"/>
+            </w:tcMar>
+          </w:tcPr>
+          <w:p>
+            <w:pPr>
+              <w:spacing w:line="240"/>
+              <w:jc w:val="left"/>
+            </w:pPr>
+            <w:r>
+              <w:rPr>
+                <w:rFonts w:ascii="Arial" w:cs="Arial" w:eastAsia="Arial" w:hAnsi="Arial"/>
+                <w:color w:val="000000"/>
+                <w:sz w:val="24"/>
+                <w:szCs w:val="24"/>
+              </w:rPr>
+              <w:t xml:space="preserve">Útil</w:t>
+            </w:r>
+          </w:p>
+        </w:tc>
+        <w:tc>
+          <w:tcPr>
+            <w:tcW w:type="dxa" w:w="3626"/>
+            <w:tcBorders>
+              <w:top w:val="none" w:color="FFFFFF" w:sz="0"/>
+              <w:left w:val="none" w:color="FFFFFF" w:sz="0"/>
+              <w:bottom w:val="none" w:color="FFFFFF" w:sz="0"/>
+              <w:right w:val="none" w:color="FFFFFF" w:sz="0"/>
+            </w:tcBorders>
+            <w:tcMar>
+              <w:top w:type="dxa" w:w="60"/>
+              <w:left w:type="dxa" w:w="100"/>
+              <w:bottom w:type="dxa" w:w="60"/>
+              <w:right w:type="dxa" w:w="100"/>
+            </w:tcMar>
+          </w:tcPr>
+          <w:p>
+            <w:pPr>
+              <w:spacing w:line="240"/>
+              <w:jc w:val="both"/>
+            </w:pPr>
+            <w:r>
+              <w:rPr>
+                <w:rFonts w:ascii="Arial" w:cs="Arial" w:eastAsia="Arial" w:hAnsi="Arial"/>
+                <w:color w:val="000000"/>
+                <w:sz w:val="24"/>
+                <w:szCs w:val="24"/>
+              </w:rPr>
+              <w:t xml:space="preserve">Canon y sobrecanon petrolero recaudado por nivel de gobierno y mes, total país, según el MEF (2005–hoy).</w:t>
             </w:r>
           </w:p>
         </w:tc>

</xml_diff>